<commit_message>
Publish v1.9 from 1fab7f1
</commit_message>
<xml_diff>
--- a/v1.8/CS-Faculty-Sheet-v1.8.docx
+++ b/v1.8/CS-Faculty-Sheet-v1.8.docx
@@ -222,7 +222,7 @@
                       <wp:inline distT="0" distB="0" distL="0" distR="0">
                         <wp:extent cx="876300" cy="1085850"/>
                         <wp:effectExtent t="0" r="0" b="0" l="0"/>
-                        <wp:docPr id="2" name="" descr="" title=""/>
+                        <wp:docPr id="1" name="" descr="" title=""/>
                         <wp:cNvGraphicFramePr>
                           <a:graphicFrameLocks xmlns:a="http://schemas.openxmlformats.org/drawingml/2006/main" noChangeAspect="1"/>
                         </wp:cNvGraphicFramePr>
@@ -553,7 +553,7 @@
                       <wp:inline distT="0" distB="0" distL="0" distR="0">
                         <wp:extent cx="876300" cy="1085850"/>
                         <wp:effectExtent t="0" r="0" b="0" l="0"/>
-                        <wp:docPr id="3" name="" descr="" title=""/>
+                        <wp:docPr id="1" name="" descr="" title=""/>
                         <wp:cNvGraphicFramePr>
                           <a:graphicFrameLocks xmlns:a="http://schemas.openxmlformats.org/drawingml/2006/main" noChangeAspect="1"/>
                         </wp:cNvGraphicFramePr>
@@ -932,7 +932,7 @@
                       <wp:inline distT="0" distB="0" distL="0" distR="0">
                         <wp:extent cx="876300" cy="1085850"/>
                         <wp:effectExtent t="0" r="0" b="0" l="0"/>
-                        <wp:docPr id="4" name="" descr="" title=""/>
+                        <wp:docPr id="1" name="" descr="" title=""/>
                         <wp:cNvGraphicFramePr>
                           <a:graphicFrameLocks xmlns:a="http://schemas.openxmlformats.org/drawingml/2006/main" noChangeAspect="1"/>
                         </wp:cNvGraphicFramePr>
@@ -1263,7 +1263,7 @@
                       <wp:inline distT="0" distB="0" distL="0" distR="0">
                         <wp:extent cx="876300" cy="1085850"/>
                         <wp:effectExtent t="0" r="0" b="0" l="0"/>
-                        <wp:docPr id="5" name="" descr="" title=""/>
+                        <wp:docPr id="1" name="" descr="" title=""/>
                         <wp:cNvGraphicFramePr>
                           <a:graphicFrameLocks xmlns:a="http://schemas.openxmlformats.org/drawingml/2006/main" noChangeAspect="1"/>
                         </wp:cNvGraphicFramePr>
@@ -1642,7 +1642,7 @@
                       <wp:inline distT="0" distB="0" distL="0" distR="0">
                         <wp:extent cx="876300" cy="1085850"/>
                         <wp:effectExtent t="0" r="0" b="0" l="0"/>
-                        <wp:docPr id="6" name="" descr="" title=""/>
+                        <wp:docPr id="1" name="" descr="" title=""/>
                         <wp:cNvGraphicFramePr>
                           <a:graphicFrameLocks xmlns:a="http://schemas.openxmlformats.org/drawingml/2006/main" noChangeAspect="1"/>
                         </wp:cNvGraphicFramePr>
@@ -1973,7 +1973,7 @@
                       <wp:inline distT="0" distB="0" distL="0" distR="0">
                         <wp:extent cx="876300" cy="1085850"/>
                         <wp:effectExtent t="0" r="0" b="0" l="0"/>
-                        <wp:docPr id="7" name="" descr="" title=""/>
+                        <wp:docPr id="1" name="" descr="" title=""/>
                         <wp:cNvGraphicFramePr>
                           <a:graphicFrameLocks xmlns:a="http://schemas.openxmlformats.org/drawingml/2006/main" noChangeAspect="1"/>
                         </wp:cNvGraphicFramePr>
@@ -2307,7 +2307,7 @@
                       <wp:inline distT="0" distB="0" distL="0" distR="0">
                         <wp:extent cx="876300" cy="1085850"/>
                         <wp:effectExtent t="0" r="0" b="0" l="0"/>
-                        <wp:docPr id="8" name="" descr="" title=""/>
+                        <wp:docPr id="1" name="" descr="" title=""/>
                         <wp:cNvGraphicFramePr>
                           <a:graphicFrameLocks xmlns:a="http://schemas.openxmlformats.org/drawingml/2006/main" noChangeAspect="1"/>
                         </wp:cNvGraphicFramePr>
@@ -2804,7 +2804,7 @@
       </w:tr>
     </w:tbl>
     <w:sectPr>
-      <w:footerReference w:type="default" r:id="rId6"/>
+      <w:footerReference w:type="default" r:id="rId7"/>
       <w:pgSz w:w="12240" w:h="15840" w:orient="portrait"/>
       <w:pgMar w:top="0" w:right="864" w:bottom="700" w:left="864" w:header="708" w:footer="0" w:gutter="0"/>
       <w:pgNumType/>
@@ -2812,6 +2812,10 @@
     </w:sectPr>
   </w:body>
 </w:document>
+</file>
+
+<file path=word/comments.xml><?xml version="1.0" encoding="utf-8"?>
+<w:comments xmlns:cx="http://schemas.microsoft.com/office/drawing/2014/chartex" xmlns:cx1="http://schemas.microsoft.com/office/drawing/2015/9/8/chartex" xmlns:cx2="http://schemas.microsoft.com/office/drawing/2015/10/21/chartex" xmlns:cx3="http://schemas.microsoft.com/office/drawing/2016/5/9/chartex" xmlns:cx4="http://schemas.microsoft.com/office/drawing/2016/5/10/chartex" xmlns:cx5="http://schemas.microsoft.com/office/drawing/2016/5/11/chartex" xmlns:cx6="http://schemas.microsoft.com/office/drawing/2016/5/12/chartex" xmlns:cx7="http://schemas.microsoft.com/office/drawing/2016/5/13/chartex" xmlns:cx8="http://schemas.microsoft.com/office/drawing/2016/5/14/chartex" xmlns:mc="http://schemas.openxmlformats.org/markup-compatibility/2006" xmlns:aink="http://schemas.microsoft.com/office/drawing/2016/ink" xmlns:am3d="http://schemas.microsoft.com/office/drawing/2017/model3d" xmlns:o="urn:schemas-microsoft-com:office:office" xmlns:r="http://schemas.openxmlformats.org/officeDocument/2006/relationships" xmlns:m="http://schemas.openxmlformats.org/officeDocument/2006/math" xmlns:v="urn:schemas-microsoft-com:vml" xmlns:wp14="http://schemas.microsoft.com/office/word/2010/wordprocessingDrawing" xmlns:wp="http://schemas.openxmlformats.org/drawingml/2006/wordprocessingDrawing" xmlns:w10="urn:schemas-microsoft-com:office:word" xmlns:w="http://schemas.openxmlformats.org/wordprocessingml/2006/main" xmlns:w14="http://schemas.microsoft.com/office/word/2010/wordml" xmlns:w15="http://schemas.microsoft.com/office/word/2012/wordml" xmlns:w16cex="http://schemas.microsoft.com/office/word/2018/wordml/cex" xmlns:w16cid="http://schemas.microsoft.com/office/word/2016/wordml/cid" xmlns:w16="http://schemas.microsoft.com/office/word/2018/wordml" xmlns:w16sdtdh="http://schemas.microsoft.com/office/word/2020/wordml/sdtdatahash" xmlns:w16se="http://schemas.microsoft.com/office/word/2015/wordml/symex" xmlns:wpg="http://schemas.microsoft.com/office/word/2010/wordprocessingGroup" xmlns:wpi="http://schemas.microsoft.com/office/word/2010/wordprocessingInk" xmlns:wne="http://schemas.microsoft.com/office/word/2006/wordml" xmlns:wps="http://schemas.microsoft.com/office/word/2010/wordprocessingShape"/>
 </file>
 
 <file path=word/endnotes.xml><?xml version="1.0" encoding="utf-8"?>
@@ -2979,7 +2983,7 @@
 <w:numbering xmlns:wpc="http://schemas.microsoft.com/office/word/2010/wordprocessingCanvas" xmlns:mc="http://schemas.openxmlformats.org/markup-compatibility/2006" xmlns:o="urn:schemas-microsoft-com:office:office" xmlns:r="http://schemas.openxmlformats.org/officeDocument/2006/relationships" xmlns:m="http://schemas.openxmlformats.org/officeDocument/2006/math" xmlns:v="urn:schemas-microsoft-com:vml" xmlns:wp14="http://schemas.microsoft.com/office/word/2010/wordprocessingDrawing" xmlns:wp="http://schemas.openxmlformats.org/drawingml/2006/wordprocessingDrawing" xmlns:w10="urn:schemas-microsoft-com:office:word" xmlns:w="http://schemas.openxmlformats.org/wordprocessingml/2006/main" xmlns:w14="http://schemas.microsoft.com/office/word/2010/wordml" xmlns:w15="http://schemas.microsoft.com/office/word/2012/wordml" xmlns:wpg="http://schemas.microsoft.com/office/word/2010/wordprocessingGroup" xmlns:wpi="http://schemas.microsoft.com/office/word/2010/wordprocessingInk" xmlns:wne="http://schemas.microsoft.com/office/word/2006/wordml" xmlns:wps="http://schemas.microsoft.com/office/word/2010/wordprocessingShape" mc:Ignorable="w14 w15 wp14">
   <w:abstractNum w:abstractNumId="1" w15:restartNumberingAfterBreak="0">
     <w:multiLevelType w:val="hybridMultilevel"/>
-    <w:lvl w:ilvl="0" w:tentative="1">
+    <w:lvl w:ilvl="0" w15:tentative="1">
       <w:start w:val="1"/>
       <w:numFmt w:val="bullet"/>
       <w:lvlText w:val="●"/>
@@ -2988,7 +2992,7 @@
         <w:ind w:left="720" w:hanging="360"/>
       </w:pPr>
     </w:lvl>
-    <w:lvl w:ilvl="1" w:tentative="1">
+    <w:lvl w:ilvl="1" w15:tentative="1">
       <w:start w:val="1"/>
       <w:numFmt w:val="bullet"/>
       <w:lvlText w:val="○"/>
@@ -2997,7 +3001,7 @@
         <w:ind w:left="1440" w:hanging="360"/>
       </w:pPr>
     </w:lvl>
-    <w:lvl w:ilvl="2" w:tentative="1">
+    <w:lvl w:ilvl="2" w15:tentative="1">
       <w:start w:val="1"/>
       <w:numFmt w:val="bullet"/>
       <w:lvlText w:val="■"/>
@@ -3006,7 +3010,7 @@
         <w:ind w:left="2160" w:hanging="360"/>
       </w:pPr>
     </w:lvl>
-    <w:lvl w:ilvl="3" w:tentative="1">
+    <w:lvl w:ilvl="3" w15:tentative="1">
       <w:start w:val="1"/>
       <w:numFmt w:val="bullet"/>
       <w:lvlText w:val="●"/>
@@ -3015,7 +3019,7 @@
         <w:ind w:left="2880" w:hanging="360"/>
       </w:pPr>
     </w:lvl>
-    <w:lvl w:ilvl="4" w:tentative="1">
+    <w:lvl w:ilvl="4" w15:tentative="1">
       <w:start w:val="1"/>
       <w:numFmt w:val="bullet"/>
       <w:lvlText w:val="○"/>
@@ -3024,7 +3028,7 @@
         <w:ind w:left="3600" w:hanging="360"/>
       </w:pPr>
     </w:lvl>
-    <w:lvl w:ilvl="5" w:tentative="1">
+    <w:lvl w:ilvl="5" w15:tentative="1">
       <w:start w:val="1"/>
       <w:numFmt w:val="bullet"/>
       <w:lvlText w:val="■"/>
@@ -3033,7 +3037,7 @@
         <w:ind w:left="4320" w:hanging="360"/>
       </w:pPr>
     </w:lvl>
-    <w:lvl w:ilvl="6" w:tentative="1">
+    <w:lvl w:ilvl="6" w15:tentative="1">
       <w:start w:val="1"/>
       <w:numFmt w:val="bullet"/>
       <w:lvlText w:val="●"/>
@@ -3042,7 +3046,7 @@
         <w:ind w:left="5040" w:hanging="360"/>
       </w:pPr>
     </w:lvl>
-    <w:lvl w:ilvl="7" w:tentative="1">
+    <w:lvl w:ilvl="7" w15:tentative="1">
       <w:start w:val="1"/>
       <w:numFmt w:val="bullet"/>
       <w:lvlText w:val="●"/>
@@ -3051,7 +3055,7 @@
         <w:ind w:left="5760" w:hanging="360"/>
       </w:pPr>
     </w:lvl>
-    <w:lvl w:ilvl="8" w:tentative="1">
+    <w:lvl w:ilvl="8" w15:tentative="1">
       <w:start w:val="1"/>
       <w:numFmt w:val="bullet"/>
       <w:lvlText w:val="●"/>
@@ -3063,7 +3067,7 @@
   </w:abstractNum>
   <w:abstractNum w:abstractNumId="2" w15:restartNumberingAfterBreak="0">
     <w:multiLevelType w:val="hybridMultilevel"/>
-    <w:lvl w:ilvl="0" w:tentative="1">
+    <w:lvl w:ilvl="0" w15:tentative="1">
       <w:start w:val="1"/>
       <w:numFmt w:val="bullet"/>
       <w:lvlText w:val="•"/>
@@ -3095,25 +3099,6 @@
     </w:rPrDefault>
     <w:pPrDefault/>
   </w:docDefaults>
-  <w:style w:type="paragraph" w:styleId="Normal" w:default="1">
-    <w:name w:val="Normal"/>
-    <w:qFormat/>
-  </w:style>
-  <w:style w:type="table" w:styleId="TableNormal" w:default="true">
-    <w:name w:val="Normal Table"/>
-    <w:uiPriority w:val="99"/>
-    <w:semiHidden/>
-    <w:unhideWhenUsed/>
-    <w:tblPr>
-      <w:tblInd w:type="dxa" w:w="0"/>
-      <w:tblCellMar>
-        <w:top w:type="dxa" w:w="0"/>
-        <w:left w:type="dxa" w:w="108"/>
-        <w:bottom w:type="dxa" w:w="0"/>
-        <w:right w:type="dxa" w:w="108"/>
-      </w:tblCellMar>
-    </w:tblPr>
-  </w:style>
   <w:style w:type="paragraph" w:styleId="Title">
     <w:name w:val="Title"/>
     <w:basedOn w:val="Normal"/>
@@ -3286,294 +3271,4 @@
     </w:rPr>
   </w:style>
 </w:styles>
-</file>
-
-<file path=word/theme/theme1.xml><?xml version="1.0" encoding="utf-8"?>
-<a:theme xmlns:a="http://schemas.openxmlformats.org/drawingml/2006/main" name="Office Theme">
-  <a:themeElements>
-    <a:clrScheme name="Office">
-      <a:dk1>
-        <a:sysClr val="windowText" lastClr="000000"/>
-      </a:dk1>
-      <a:lt1>
-        <a:sysClr val="window" lastClr="FFFFFF"/>
-      </a:lt1>
-      <a:dk2>
-        <a:srgbClr val="44546A"/>
-      </a:dk2>
-      <a:lt2>
-        <a:srgbClr val="E7E6E6"/>
-      </a:lt2>
-      <a:accent1>
-        <a:srgbClr val="4472C4"/>
-      </a:accent1>
-      <a:accent2>
-        <a:srgbClr val="ED7D31"/>
-      </a:accent2>
-      <a:accent3>
-        <a:srgbClr val="A5A5A5"/>
-      </a:accent3>
-      <a:accent4>
-        <a:srgbClr val="FFC000"/>
-      </a:accent4>
-      <a:accent5>
-        <a:srgbClr val="5B9BD5"/>
-      </a:accent5>
-      <a:accent6>
-        <a:srgbClr val="70AD47"/>
-      </a:accent6>
-      <a:hlink>
-        <a:srgbClr val="0563C1"/>
-      </a:hlink>
-      <a:folHlink>
-        <a:srgbClr val="954F72"/>
-      </a:folHlink>
-    </a:clrScheme>
-    <a:fontScheme name="Office">
-      <a:majorFont>
-        <a:latin typeface="Calibri Light" panose="020F0302020204030204"/>
-        <a:ea typeface=""/>
-        <a:cs typeface=""/>
-        <a:font script="Jpan" typeface="游ゴシック Light"/>
-        <a:font script="Hang" typeface="맑은 고딕"/>
-        <a:font script="Hans" typeface="等线 Light"/>
-        <a:font script="Hant" typeface="新細明體"/>
-        <a:font script="Arab" typeface="Times New Roman"/>
-        <a:font script="Hebr" typeface="Times New Roman"/>
-        <a:font script="Thai" typeface="Angsana New"/>
-        <a:font script="Ethi" typeface="Nyala"/>
-        <a:font script="Beng" typeface="Vrinda"/>
-        <a:font script="Gujr" typeface="Shruti"/>
-        <a:font script="Khmr" typeface="MoolBoran"/>
-        <a:font script="Knda" typeface="Tunga"/>
-        <a:font script="Guru" typeface="Raavi"/>
-        <a:font script="Cans" typeface="Euphemia"/>
-        <a:font script="Cher" typeface="Plantagenet Cherokee"/>
-        <a:font script="Yiii" typeface="Microsoft Yi Baiti"/>
-        <a:font script="Tibt" typeface="Microsoft Himalaya"/>
-        <a:font script="Thaa" typeface="MV Boli"/>
-        <a:font script="Deva" typeface="Mangal"/>
-        <a:font script="Telu" typeface="Gautami"/>
-        <a:font script="Taml" typeface="Latha"/>
-        <a:font script="Syrc" typeface="Estrangelo Edessa"/>
-        <a:font script="Orya" typeface="Kalinga"/>
-        <a:font script="Mlym" typeface="Kartika"/>
-        <a:font script="Laoo" typeface="DokChampa"/>
-        <a:font script="Sinh" typeface="Iskoola Pota"/>
-        <a:font script="Mong" typeface="Mongolian Baiti"/>
-        <a:font script="Viet" typeface="Times New Roman"/>
-        <a:font script="Uigh" typeface="Microsoft Uighur"/>
-        <a:font script="Geor" typeface="Sylfaen"/>
-        <a:font script="Armn" typeface="Arial"/>
-        <a:font script="Bugi" typeface="Leelawadee UI"/>
-        <a:font script="Bopo" typeface="Microsoft JhengHei"/>
-        <a:font script="Java" typeface="Javanese Text"/>
-        <a:font script="Lisu" typeface="Segoe UI"/>
-        <a:font script="Mymr" typeface="Myanmar Text"/>
-        <a:font script="Nkoo" typeface="Ebrima"/>
-        <a:font script="Olck" typeface="Nirmala UI"/>
-        <a:font script="Osma" typeface="Ebrima"/>
-        <a:font script="Phag" typeface="Phagspa"/>
-        <a:font script="Syrn" typeface="Estrangelo Edessa"/>
-        <a:font script="Syrj" typeface="Estrangelo Edessa"/>
-        <a:font script="Syre" typeface="Estrangelo Edessa"/>
-        <a:font script="Sora" typeface="Nirmala UI"/>
-        <a:font script="Tale" typeface="Microsoft Tai Le"/>
-        <a:font script="Talu" typeface="Microsoft New Tai Lue"/>
-        <a:font script="Tfng" typeface="Ebrima"/>
-      </a:majorFont>
-      <a:minorFont>
-        <a:latin typeface="Calibri" panose="020F0502020204030204"/>
-        <a:ea typeface=""/>
-        <a:cs typeface=""/>
-        <a:font script="Jpan" typeface="游明朝"/>
-        <a:font script="Hang" typeface="맑은 고딕"/>
-        <a:font script="Hans" typeface="等线"/>
-        <a:font script="Hant" typeface="新細明體"/>
-        <a:font script="Arab" typeface="Arial"/>
-        <a:font script="Hebr" typeface="Arial"/>
-        <a:font script="Thai" typeface="Cordia New"/>
-        <a:font script="Ethi" typeface="Nyala"/>
-        <a:font script="Beng" typeface="Vrinda"/>
-        <a:font script="Gujr" typeface="Shruti"/>
-        <a:font script="Khmr" typeface="DaunPenh"/>
-        <a:font script="Knda" typeface="Tunga"/>
-        <a:font script="Guru" typeface="Raavi"/>
-        <a:font script="Cans" typeface="Euphemia"/>
-        <a:font script="Cher" typeface="Plantagenet Cherokee"/>
-        <a:font script="Yiii" typeface="Microsoft Yi Baiti"/>
-        <a:font script="Tibt" typeface="Microsoft Himalaya"/>
-        <a:font script="Thaa" typeface="MV Boli"/>
-        <a:font script="Deva" typeface="Mangal"/>
-        <a:font script="Telu" typeface="Gautami"/>
-        <a:font script="Taml" typeface="Latha"/>
-        <a:font script="Syrc" typeface="Estrangelo Edessa"/>
-        <a:font script="Orya" typeface="Kalinga"/>
-        <a:font script="Mlym" typeface="Kartika"/>
-        <a:font script="Laoo" typeface="DokChampa"/>
-        <a:font script="Sinh" typeface="Iskoola Pota"/>
-        <a:font script="Mong" typeface="Mongolian Baiti"/>
-        <a:font script="Viet" typeface="Arial"/>
-        <a:font script="Uigh" typeface="Microsoft Uighur"/>
-        <a:font script="Geor" typeface="Sylfaen"/>
-        <a:font script="Armn" typeface="Arial"/>
-        <a:font script="Bugi" typeface="Leelawadee UI"/>
-        <a:font script="Bopo" typeface="Microsoft JhengHei"/>
-        <a:font script="Java" typeface="Javanese Text"/>
-        <a:font script="Lisu" typeface="Segoe UI"/>
-        <a:font script="Mymr" typeface="Myanmar Text"/>
-        <a:font script="Nkoo" typeface="Ebrima"/>
-        <a:font script="Olck" typeface="Nirmala UI"/>
-        <a:font script="Osma" typeface="Ebrima"/>
-        <a:font script="Phag" typeface="Phagspa"/>
-        <a:font script="Syrn" typeface="Estrangelo Edessa"/>
-        <a:font script="Syrj" typeface="Estrangelo Edessa"/>
-        <a:font script="Syre" typeface="Estrangelo Edessa"/>
-        <a:font script="Sora" typeface="Nirmala UI"/>
-        <a:font script="Tale" typeface="Microsoft Tai Le"/>
-        <a:font script="Talu" typeface="Microsoft New Tai Lue"/>
-        <a:font script="Tfng" typeface="Ebrima"/>
-      </a:minorFont>
-    </a:fontScheme>
-    <a:fmtScheme name="Office">
-      <a:fillStyleLst>
-        <a:solidFill>
-          <a:schemeClr val="phClr"/>
-        </a:solidFill>
-        <a:gradFill rotWithShape="true">
-          <a:gsLst>
-            <a:gs pos="0">
-              <a:schemeClr val="phClr">
-                <a:lumMod val="110000"/>
-                <a:satMod val="105000"/>
-                <a:tint val="67000"/>
-              </a:schemeClr>
-            </a:gs>
-            <a:gs pos="50000">
-              <a:schemeClr val="phClr">
-                <a:lumMod val="105000"/>
-                <a:satMod val="103000"/>
-                <a:tint val="73000"/>
-              </a:schemeClr>
-            </a:gs>
-            <a:gs pos="100000">
-              <a:schemeClr val="phClr">
-                <a:lumMod val="105000"/>
-                <a:satMod val="109000"/>
-                <a:tint val="81000"/>
-              </a:schemeClr>
-            </a:gs>
-          </a:gsLst>
-          <a:lin ang="5400000" scaled="false"/>
-        </a:gradFill>
-        <a:gradFill rotWithShape="true">
-          <a:gsLst>
-            <a:gs pos="0">
-              <a:schemeClr val="phClr">
-                <a:satMod val="103000"/>
-                <a:lumMod val="102000"/>
-                <a:tint val="94000"/>
-              </a:schemeClr>
-            </a:gs>
-            <a:gs pos="50000">
-              <a:schemeClr val="phClr">
-                <a:satMod val="110000"/>
-                <a:lumMod val="100000"/>
-                <a:shade val="100000"/>
-              </a:schemeClr>
-            </a:gs>
-            <a:gs pos="100000">
-              <a:schemeClr val="phClr">
-                <a:lumMod val="99000"/>
-                <a:satMod val="120000"/>
-                <a:shade val="78000"/>
-              </a:schemeClr>
-            </a:gs>
-          </a:gsLst>
-          <a:lin ang="5400000" scaled="false"/>
-        </a:gradFill>
-      </a:fillStyleLst>
-      <a:lnStyleLst>
-        <a:ln w="6350" cap="flat" cmpd="sng" algn="ctr">
-          <a:solidFill>
-            <a:schemeClr val="phClr"/>
-          </a:solidFill>
-          <a:prstDash val="solid"/>
-          <a:miter lim="800000"/>
-        </a:ln>
-        <a:ln w="12700" cap="flat" cmpd="sng" algn="ctr">
-          <a:solidFill>
-            <a:schemeClr val="phClr"/>
-          </a:solidFill>
-          <a:prstDash val="solid"/>
-          <a:miter lim="800000"/>
-        </a:ln>
-        <a:ln w="19050" cap="flat" cmpd="sng" algn="ctr">
-          <a:solidFill>
-            <a:schemeClr val="phClr"/>
-          </a:solidFill>
-          <a:prstDash val="solid"/>
-          <a:miter lim="800000"/>
-        </a:ln>
-      </a:lnStyleLst>
-      <a:effectStyleLst>
-        <a:effectStyle>
-          <a:effectLst/>
-        </a:effectStyle>
-        <a:effectStyle>
-          <a:effectLst/>
-        </a:effectStyle>
-        <a:effectStyle>
-          <a:effectLst>
-            <a:outerShdw blurRad="57150" dist="19050" dir="5400000" algn="ctr" rotWithShape="false">
-              <a:srgbClr val="000000">
-                <a:alpha val="63000"/>
-              </a:srgbClr>
-            </a:outerShdw>
-          </a:effectLst>
-        </a:effectStyle>
-      </a:effectStyleLst>
-      <a:bgFillStyleLst>
-        <a:solidFill>
-          <a:schemeClr val="phClr"/>
-        </a:solidFill>
-        <a:solidFill>
-          <a:schemeClr val="phClr">
-            <a:tint val="95000"/>
-            <a:satMod val="170000"/>
-          </a:schemeClr>
-        </a:solidFill>
-        <a:gradFill rotWithShape="true">
-          <a:gsLst>
-            <a:gs pos="0">
-              <a:schemeClr val="phClr">
-                <a:tint val="93000"/>
-                <a:satMod val="150000"/>
-                <a:shade val="98000"/>
-                <a:lumMod val="102000"/>
-              </a:schemeClr>
-            </a:gs>
-            <a:gs pos="50000">
-              <a:schemeClr val="phClr">
-                <a:tint val="98000"/>
-                <a:satMod val="130000"/>
-                <a:shade val="90000"/>
-                <a:lumMod val="103000"/>
-              </a:schemeClr>
-            </a:gs>
-            <a:gs pos="100000">
-              <a:schemeClr val="phClr">
-                <a:shade val="63000"/>
-                <a:satMod val="120000"/>
-              </a:schemeClr>
-            </a:gs>
-          </a:gsLst>
-          <a:lin ang="5400000" scaled="false"/>
-        </a:gradFill>
-      </a:bgFillStyleLst>
-    </a:fmtScheme>
-  </a:themeElements>
-  <a:objectDefaults/>
-  <a:extraClrSchemeLst/>
-</a:theme>
 </file>
</xml_diff>